<commit_message>
style: Enlarge font sizes across 2050 forecast, carbon calculator, and Word report to standard legible dimensions
</commit_message>
<xml_diff>
--- a/Blue_Carbon_Guardian_Project_Report.docx
+++ b/Blue_Carbon_Guardian_Project_Report.docx
@@ -11,7 +11,7 @@
           <w:rFonts w:ascii="Arial" w:hAnsi="Arial"/>
           <w:b/>
           <w:color w:val="10B981"/>
-          <w:sz w:val="40"/>
+          <w:sz w:val="44"/>
         </w:rPr>
         <w:t>ACADEMIC PROJECT SUBMISSION WRITEUP &amp; TECHNICAL REPORT</w:t>
       </w:r>
@@ -25,7 +25,7 @@
           <w:rFonts w:ascii="Arial" w:hAnsi="Arial"/>
           <w:i/>
           <w:color w:val="64748B"/>
-          <w:sz w:val="26"/>
+          <w:sz w:val="28"/>
         </w:rPr>
         <w:t>Blue Carbon Guardian: AI-Driven Coastal Ecosystem Risk Assessment &amp; 2050 Climate Forecasting System for Tamil Nadu</w:t>
       </w:r>
@@ -51,7 +51,7 @@
             <w:r>
               <w:rPr>
                 <w:b/>
-                <w:sz w:val="21"/>
+                <w:sz w:val="23"/>
               </w:rPr>
               <w:t>Institution:</w:t>
             </w:r>
@@ -65,7 +65,7 @@
           <w:p>
             <w:r>
               <w:rPr>
-                <w:sz w:val="21"/>
+                <w:sz w:val="23"/>
               </w:rPr>
               <w:t>Department of Civil &amp; Environmental Engineering, VIT Chennai</w:t>
             </w:r>
@@ -82,7 +82,7 @@
             <w:r>
               <w:rPr>
                 <w:b/>
-                <w:sz w:val="21"/>
+                <w:sz w:val="23"/>
               </w:rPr>
               <w:t>Guide / Supervisor:</w:t>
             </w:r>
@@ -96,7 +96,7 @@
           <w:p>
             <w:r>
               <w:rPr>
-                <w:sz w:val="21"/>
+                <w:sz w:val="23"/>
               </w:rPr>
               <w:t>Dr. K. Palanivelu</w:t>
             </w:r>
@@ -113,7 +113,7 @@
             <w:r>
               <w:rPr>
                 <w:b/>
-                <w:sz w:val="21"/>
+                <w:sz w:val="23"/>
               </w:rPr>
               <w:t>Geographic Focus:</w:t>
             </w:r>
@@ -127,7 +127,7 @@
           <w:p>
             <w:r>
               <w:rPr>
-                <w:sz w:val="21"/>
+                <w:sz w:val="23"/>
               </w:rPr>
               <w:t>12 Coastal Sanctuary Sites, Tamil Nadu, India</w:t>
             </w:r>
@@ -144,7 +144,7 @@
             <w:r>
               <w:rPr>
                 <w:b/>
-                <w:sz w:val="21"/>
+                <w:sz w:val="23"/>
               </w:rPr>
               <w:t>Academic Phases:</w:t>
             </w:r>
@@ -158,7 +158,7 @@
           <w:p>
             <w:r>
               <w:rPr>
-                <w:sz w:val="21"/>
+                <w:sz w:val="23"/>
               </w:rPr>
               <w:t>Review 1 (DA-1), Review 2 (DA-2), Review 3 (DA-3)</w:t>
             </w:r>
@@ -176,18 +176,26 @@
           <w:rFonts w:ascii="Arial" w:hAnsi="Arial"/>
           <w:b/>
           <w:color w:val="0F172A"/>
-          <w:sz w:val="30"/>
+          <w:sz w:val="32"/>
         </w:rPr>
         <w:t>1. Executive Summary &amp; Project Objectives</w:t>
       </w:r>
     </w:p>
     <w:p>
       <w:r>
+        <w:rPr>
+          <w:rFonts w:ascii="Arial" w:hAnsi="Arial"/>
+          <w:sz w:val="24"/>
+        </w:rPr>
         <w:t>Mangrove forests along the Tamil Nadu coastline are premier 'Blue Carbon' ecosystems, storing up to 10 times more carbon per hectare than terrestrial tropical forests while serving as natural bio-shields against ocean storm surges and shoreline erosion. However, accelerating sea-level rise, heatwaves, hypersalinity, and coastal erosion threaten these critical habitats.</w:t>
       </w:r>
     </w:p>
     <w:p>
       <w:r>
+        <w:rPr>
+          <w:rFonts w:ascii="Arial" w:hAnsi="Arial"/>
+          <w:sz w:val="24"/>
+        </w:rPr>
         <w:t>Blue Carbon Guardian is an advanced, full-stack AI-driven web application and decision-support system designed to monitor, analyze, and forecast coastal ecosystem vulnerability across 12 primary sanctuary sites in Tamil Nadu. The system integrates multi-source government baseline datasets (FSI, IMD, INCOIS, NCCR, TNFD) with machine learning algorithms (Decision Trees, XGBoost, Polynomial &amp; Ridge Regression) and Copernicus Sentinel-2 10m satellite remote sensing to project mangrove health trajectories up to Year 2050 under IPCC AR6 emission scenarios.</w:t>
       </w:r>
     </w:p>
@@ -200,13 +208,17 @@
           <w:rFonts w:ascii="Arial" w:hAnsi="Arial"/>
           <w:b/>
           <w:color w:val="0F172A"/>
-          <w:sz w:val="30"/>
+          <w:sz w:val="32"/>
         </w:rPr>
         <w:t>2. Complete Data Provenance &amp; Dataset Specification</w:t>
       </w:r>
     </w:p>
     <w:p>
       <w:r>
+        <w:rPr>
+          <w:rFonts w:ascii="Arial" w:hAnsi="Arial"/>
+          <w:sz w:val="24"/>
+        </w:rPr>
         <w:t>All baseline parameters were synthesized from official government publications, satellite telemetry, and tide gauge records:</w:t>
       </w:r>
     </w:p>
@@ -235,9 +247,10 @@
             </w:pPr>
             <w:r>
               <w:rPr>
+                <w:rFonts w:ascii="Arial" w:hAnsi="Arial"/>
                 <w:b/>
                 <w:color w:val="FFFFFF"/>
-                <w:sz w:val="19"/>
+                <w:sz w:val="22"/>
               </w:rPr>
               <w:t>Data Variable</w:t>
             </w:r>
@@ -254,9 +267,10 @@
             </w:pPr>
             <w:r>
               <w:rPr>
+                <w:rFonts w:ascii="Arial" w:hAnsi="Arial"/>
                 <w:b/>
                 <w:color w:val="FFFFFF"/>
-                <w:sz w:val="19"/>
+                <w:sz w:val="22"/>
               </w:rPr>
               <w:t>Source Agency</w:t>
             </w:r>
@@ -273,9 +287,10 @@
             </w:pPr>
             <w:r>
               <w:rPr>
+                <w:rFonts w:ascii="Arial" w:hAnsi="Arial"/>
                 <w:b/>
                 <w:color w:val="FFFFFF"/>
-                <w:sz w:val="19"/>
+                <w:sz w:val="22"/>
               </w:rPr>
               <w:t>Temporal Range</w:t>
             </w:r>
@@ -292,9 +307,10 @@
             </w:pPr>
             <w:r>
               <w:rPr>
+                <w:rFonts w:ascii="Arial" w:hAnsi="Arial"/>
                 <w:b/>
                 <w:color w:val="FFFFFF"/>
-                <w:sz w:val="19"/>
+                <w:sz w:val="22"/>
               </w:rPr>
               <w:t>Unit / Format</w:t>
             </w:r>
@@ -311,9 +327,10 @@
             </w:pPr>
             <w:r>
               <w:rPr>
+                <w:rFonts w:ascii="Arial" w:hAnsi="Arial"/>
                 <w:b/>
                 <w:color w:val="FFFFFF"/>
-                <w:sz w:val="19"/>
+                <w:sz w:val="22"/>
               </w:rPr>
               <w:t>Purpose in Project</w:t>
             </w:r>
@@ -329,7 +346,8 @@
           <w:p>
             <w:r>
               <w:rPr>
-                <w:sz w:val="18"/>
+                <w:rFonts w:ascii="Arial" w:hAnsi="Arial"/>
+                <w:sz w:val="21"/>
               </w:rPr>
               <w:t>Mangrove Canopy Cover (ha)</w:t>
             </w:r>
@@ -343,7 +361,8 @@
           <w:p>
             <w:r>
               <w:rPr>
-                <w:sz w:val="18"/>
+                <w:rFonts w:ascii="Arial" w:hAnsi="Arial"/>
+                <w:sz w:val="21"/>
               </w:rPr>
               <w:t>Forest Survey of India (FSI ISFR)</w:t>
             </w:r>
@@ -357,7 +376,8 @@
           <w:p>
             <w:r>
               <w:rPr>
-                <w:sz w:val="18"/>
+                <w:rFonts w:ascii="Arial" w:hAnsi="Arial"/>
+                <w:sz w:val="21"/>
               </w:rPr>
               <w:t>2013 – 2023 (Biennial)</w:t>
             </w:r>
@@ -371,7 +391,8 @@
           <w:p>
             <w:r>
               <w:rPr>
-                <w:sz w:val="18"/>
+                <w:rFonts w:ascii="Arial" w:hAnsi="Arial"/>
+                <w:sz w:val="21"/>
               </w:rPr>
               <w:t>Hectares (ha)</w:t>
             </w:r>
@@ -385,7 +406,8 @@
           <w:p>
             <w:r>
               <w:rPr>
-                <w:sz w:val="18"/>
+                <w:rFonts w:ascii="Arial" w:hAnsi="Arial"/>
+                <w:sz w:val="21"/>
               </w:rPr>
               <w:t>10-Year historical canopy growth baseline.</w:t>
             </w:r>
@@ -401,7 +423,8 @@
           <w:p>
             <w:r>
               <w:rPr>
-                <w:sz w:val="18"/>
+                <w:rFonts w:ascii="Arial" w:hAnsi="Arial"/>
+                <w:sz w:val="21"/>
               </w:rPr>
               <w:t>Cyclonic Storm History</w:t>
             </w:r>
@@ -415,7 +438,8 @@
           <w:p>
             <w:r>
               <w:rPr>
-                <w:sz w:val="18"/>
+                <w:rFonts w:ascii="Arial" w:hAnsi="Arial"/>
+                <w:sz w:val="21"/>
               </w:rPr>
               <w:t>India Meteorological Dept (IMD)</w:t>
             </w:r>
@@ -429,7 +453,8 @@
           <w:p>
             <w:r>
               <w:rPr>
-                <w:sz w:val="18"/>
+                <w:rFonts w:ascii="Arial" w:hAnsi="Arial"/>
+                <w:sz w:val="21"/>
               </w:rPr>
               <w:t>1991 – 2023 (32-Year Record)</w:t>
             </w:r>
@@ -443,7 +468,8 @@
           <w:p>
             <w:r>
               <w:rPr>
-                <w:sz w:val="18"/>
+                <w:rFonts w:ascii="Arial" w:hAnsi="Arial"/>
+                <w:sz w:val="21"/>
               </w:rPr>
               <w:t>Hit Track Counts</w:t>
             </w:r>
@@ -457,7 +483,8 @@
           <w:p>
             <w:r>
               <w:rPr>
-                <w:sz w:val="18"/>
+                <w:rFonts w:ascii="Arial" w:hAnsi="Arial"/>
+                <w:sz w:val="21"/>
               </w:rPr>
               <w:t>Quantifying cyclone damage &amp; wind stress.</w:t>
             </w:r>
@@ -473,7 +500,8 @@
           <w:p>
             <w:r>
               <w:rPr>
-                <w:sz w:val="18"/>
+                <w:rFonts w:ascii="Arial" w:hAnsi="Arial"/>
+                <w:sz w:val="21"/>
               </w:rPr>
               <w:t>Temperature Normals (°C)</w:t>
             </w:r>
@@ -487,7 +515,8 @@
           <w:p>
             <w:r>
               <w:rPr>
-                <w:sz w:val="18"/>
+                <w:rFonts w:ascii="Arial" w:hAnsi="Arial"/>
+                <w:sz w:val="21"/>
               </w:rPr>
               <w:t>India Meteorological Dept (IMD)</w:t>
             </w:r>
@@ -501,7 +530,8 @@
           <w:p>
             <w:r>
               <w:rPr>
-                <w:sz w:val="18"/>
+                <w:rFonts w:ascii="Arial" w:hAnsi="Arial"/>
+                <w:sz w:val="21"/>
               </w:rPr>
               <w:t>1991 – 2020 (30-Yr Normals)</w:t>
             </w:r>
@@ -515,7 +545,8 @@
           <w:p>
             <w:r>
               <w:rPr>
-                <w:sz w:val="18"/>
+                <w:rFonts w:ascii="Arial" w:hAnsi="Arial"/>
+                <w:sz w:val="21"/>
               </w:rPr>
               <w:t>Max Temp (°C)</w:t>
             </w:r>
@@ -529,7 +560,8 @@
           <w:p>
             <w:r>
               <w:rPr>
-                <w:sz w:val="18"/>
+                <w:rFonts w:ascii="Arial" w:hAnsi="Arial"/>
+                <w:sz w:val="21"/>
               </w:rPr>
               <w:t>Thermal stress modeling &amp; heatwave impact.</w:t>
             </w:r>
@@ -545,7 +577,8 @@
           <w:p>
             <w:r>
               <w:rPr>
-                <w:sz w:val="18"/>
+                <w:rFonts w:ascii="Arial" w:hAnsi="Arial"/>
+                <w:sz w:val="21"/>
               </w:rPr>
               <w:t>Sea Level Rise Rates</w:t>
             </w:r>
@@ -559,7 +592,8 @@
           <w:p>
             <w:r>
               <w:rPr>
-                <w:sz w:val="18"/>
+                <w:rFonts w:ascii="Arial" w:hAnsi="Arial"/>
+                <w:sz w:val="21"/>
               </w:rPr>
               <w:t>INCOIS &amp; Tide Gauge Stations</w:t>
             </w:r>
@@ -573,7 +607,8 @@
           <w:p>
             <w:r>
               <w:rPr>
-                <w:sz w:val="18"/>
+                <w:rFonts w:ascii="Arial" w:hAnsi="Arial"/>
+                <w:sz w:val="21"/>
               </w:rPr>
               <w:t>1990 – 2023 (Continuous)</w:t>
             </w:r>
@@ -587,7 +622,8 @@
           <w:p>
             <w:r>
               <w:rPr>
-                <w:sz w:val="18"/>
+                <w:rFonts w:ascii="Arial" w:hAnsi="Arial"/>
+                <w:sz w:val="21"/>
               </w:rPr>
               <w:t>mm/year (mm/yr)</w:t>
             </w:r>
@@ -601,7 +637,8 @@
           <w:p>
             <w:r>
               <w:rPr>
-                <w:sz w:val="18"/>
+                <w:rFonts w:ascii="Arial" w:hAnsi="Arial"/>
+                <w:sz w:val="21"/>
               </w:rPr>
               <w:t>Modeling coastal inundation &amp; ocean swash.</w:t>
             </w:r>
@@ -617,7 +654,8 @@
           <w:p>
             <w:r>
               <w:rPr>
-                <w:sz w:val="18"/>
+                <w:rFonts w:ascii="Arial" w:hAnsi="Arial"/>
+                <w:sz w:val="21"/>
               </w:rPr>
               <w:t>Shoreline Erosion Rates</w:t>
             </w:r>
@@ -631,7 +669,8 @@
           <w:p>
             <w:r>
               <w:rPr>
-                <w:sz w:val="18"/>
+                <w:rFonts w:ascii="Arial" w:hAnsi="Arial"/>
+                <w:sz w:val="21"/>
               </w:rPr>
               <w:t>National Centre for Coastal Research</w:t>
             </w:r>
@@ -645,7 +684,8 @@
           <w:p>
             <w:r>
               <w:rPr>
-                <w:sz w:val="18"/>
+                <w:rFonts w:ascii="Arial" w:hAnsi="Arial"/>
+                <w:sz w:val="21"/>
               </w:rPr>
               <w:t>1990 – 2022 (Atlas)</w:t>
             </w:r>
@@ -659,7 +699,8 @@
           <w:p>
             <w:r>
               <w:rPr>
-                <w:sz w:val="18"/>
+                <w:rFonts w:ascii="Arial" w:hAnsi="Arial"/>
+                <w:sz w:val="21"/>
               </w:rPr>
               <w:t>Meters/year (m/yr)</w:t>
             </w:r>
@@ -673,7 +714,8 @@
           <w:p>
             <w:r>
               <w:rPr>
-                <w:sz w:val="18"/>
+                <w:rFonts w:ascii="Arial" w:hAnsi="Arial"/>
+                <w:sz w:val="21"/>
               </w:rPr>
               <w:t>Primary physical threat driver of land loss.</w:t>
             </w:r>
@@ -689,7 +731,8 @@
           <w:p>
             <w:r>
               <w:rPr>
-                <w:sz w:val="18"/>
+                <w:rFonts w:ascii="Arial" w:hAnsi="Arial"/>
+                <w:sz w:val="21"/>
               </w:rPr>
               <w:t>Estuarine Soil Salinity</w:t>
             </w:r>
@@ -703,7 +746,8 @@
           <w:p>
             <w:r>
               <w:rPr>
-                <w:sz w:val="18"/>
+                <w:rFonts w:ascii="Arial" w:hAnsi="Arial"/>
+                <w:sz w:val="21"/>
               </w:rPr>
               <w:t>Tamil Nadu Forest Dept (TNFD)</w:t>
             </w:r>
@@ -717,7 +761,8 @@
           <w:p>
             <w:r>
               <w:rPr>
-                <w:sz w:val="18"/>
+                <w:rFonts w:ascii="Arial" w:hAnsi="Arial"/>
+                <w:sz w:val="21"/>
               </w:rPr>
               <w:t>2015 – 2023</w:t>
             </w:r>
@@ -731,7 +776,8 @@
           <w:p>
             <w:r>
               <w:rPr>
-                <w:sz w:val="18"/>
+                <w:rFonts w:ascii="Arial" w:hAnsi="Arial"/>
+                <w:sz w:val="21"/>
               </w:rPr>
               <w:t>Parts Per Thousand (ppt)</w:t>
             </w:r>
@@ -745,7 +791,8 @@
           <w:p>
             <w:r>
               <w:rPr>
-                <w:sz w:val="18"/>
+                <w:rFonts w:ascii="Arial" w:hAnsi="Arial"/>
+                <w:sz w:val="21"/>
               </w:rPr>
               <w:t>Assessing freshwater flushing deficits.</w:t>
             </w:r>
@@ -761,7 +808,8 @@
           <w:p>
             <w:r>
               <w:rPr>
-                <w:sz w:val="18"/>
+                <w:rFonts w:ascii="Arial" w:hAnsi="Arial"/>
+                <w:sz w:val="21"/>
               </w:rPr>
               <w:t>Satellite Telemetry</w:t>
             </w:r>
@@ -775,7 +823,8 @@
           <w:p>
             <w:r>
               <w:rPr>
-                <w:sz w:val="18"/>
+                <w:rFonts w:ascii="Arial" w:hAnsi="Arial"/>
+                <w:sz w:val="21"/>
               </w:rPr>
               <w:t>Copernicus Sentinel-2 MSI L2A</w:t>
             </w:r>
@@ -789,7 +838,8 @@
           <w:p>
             <w:r>
               <w:rPr>
-                <w:sz w:val="18"/>
+                <w:rFonts w:ascii="Arial" w:hAnsi="Arial"/>
+                <w:sz w:val="21"/>
               </w:rPr>
               <w:t>2023 – 2026 Telemetry</w:t>
             </w:r>
@@ -803,7 +853,8 @@
           <w:p>
             <w:r>
               <w:rPr>
-                <w:sz w:val="18"/>
+                <w:rFonts w:ascii="Arial" w:hAnsi="Arial"/>
+                <w:sz w:val="21"/>
               </w:rPr>
               <w:t>10m Spatial Resolution</w:t>
             </w:r>
@@ -817,7 +868,8 @@
           <w:p>
             <w:r>
               <w:rPr>
-                <w:sz w:val="18"/>
+                <w:rFonts w:ascii="Arial" w:hAnsi="Arial"/>
+                <w:sz w:val="21"/>
               </w:rPr>
               <w:t>Real-time NDVI vegetation health index.</w:t>
             </w:r>
@@ -835,7 +887,7 @@
           <w:rFonts w:ascii="Arial" w:hAnsi="Arial"/>
           <w:b/>
           <w:color w:val="0F172A"/>
-          <w:sz w:val="30"/>
+          <w:sz w:val="32"/>
         </w:rPr>
         <w:t>3. Phase-by-Phase Review Workflow &amp; Deliverables</w:t>
       </w:r>
@@ -849,7 +901,7 @@
           <w:rFonts w:ascii="Arial" w:hAnsi="Arial"/>
           <w:b/>
           <w:color w:val="10B981"/>
-          <w:sz w:val="26"/>
+          <w:sz w:val="28"/>
         </w:rPr>
         <w:t>Review 1 (Phase 1 / DA-1): GIS Map &amp; Baseline Data Foundation</w:t>
       </w:r>
@@ -859,6 +911,10 @@
         <w:pStyle w:val="ListBullet"/>
       </w:pPr>
       <w:r>
+        <w:rPr>
+          <w:rFonts w:ascii="Arial" w:hAnsi="Arial"/>
+          <w:sz w:val="24"/>
+        </w:rPr>
         <w:t>Interactive Leaflet GIS Mapping Suite: Displaying sanctuary boundaries, Ramsar classifications, and district coordinates.</w:t>
       </w:r>
     </w:p>
@@ -867,6 +923,10 @@
         <w:pStyle w:val="ListBullet"/>
       </w:pPr>
       <w:r>
+        <w:rPr>
+          <w:rFonts w:ascii="Arial" w:hAnsi="Arial"/>
+          <w:sz w:val="24"/>
+        </w:rPr>
         <w:t>Global Dashboard: Aggregation cards for total Tamil Nadu mangrove area, average sea level rise, and historical cyclone hits.</w:t>
       </w:r>
     </w:p>
@@ -875,6 +935,10 @@
         <w:pStyle w:val="ListBullet"/>
       </w:pPr>
       <w:r>
+        <w:rPr>
+          <w:rFonts w:ascii="Arial" w:hAnsi="Arial"/>
+          <w:sz w:val="24"/>
+        </w:rPr>
         <w:t>IMD Decadal Cyclone Timeline (1991–2023): Tracking major cyclones (Thane 2011, Vardah 2016, Gaja 2018, Michaung 2023).</w:t>
       </w:r>
     </w:p>
@@ -883,6 +947,10 @@
         <w:pStyle w:val="ListBullet"/>
       </w:pPr>
       <w:r>
+        <w:rPr>
+          <w:rFonts w:ascii="Arial" w:hAnsi="Arial"/>
+          <w:sz w:val="24"/>
+        </w:rPr>
         <w:t>Community Conservation Log: Field reporting module for volunteers to submit observation logs and plant saplings.</w:t>
       </w:r>
     </w:p>
@@ -891,6 +959,10 @@
         <w:pStyle w:val="ListBullet"/>
       </w:pPr>
       <w:r>
+        <w:rPr>
+          <w:rFonts w:ascii="Arial" w:hAnsi="Arial"/>
+          <w:sz w:val="24"/>
+        </w:rPr>
         <w:t>Academic Environmental Glossary: Reference dictionary for terms like Blue Carbon, Ramsar Sites, and Fishbone Canalization.</w:t>
       </w:r>
     </w:p>
@@ -903,7 +975,7 @@
           <w:rFonts w:ascii="Arial" w:hAnsi="Arial"/>
           <w:b/>
           <w:color w:val="10B981"/>
-          <w:sz w:val="26"/>
+          <w:sz w:val="28"/>
         </w:rPr>
         <w:t>Review 2 (Phase 2 / DA-2): AI Risk Engine &amp; What-If Climate Simulator</w:t>
       </w:r>
@@ -913,6 +985,10 @@
         <w:pStyle w:val="ListBullet"/>
       </w:pPr>
       <w:r>
+        <w:rPr>
+          <w:rFonts w:ascii="Arial" w:hAnsi="Arial"/>
+          <w:sz w:val="24"/>
+        </w:rPr>
         <w:t>Multi-Factor ML Vulnerability Model: Trained on 168 multi-temporal data vector rows across Tamil Nadu sanctuaries.</w:t>
       </w:r>
     </w:p>
@@ -921,6 +997,10 @@
         <w:pStyle w:val="ListBullet"/>
       </w:pPr>
       <w:r>
+        <w:rPr>
+          <w:rFonts w:ascii="Arial" w:hAnsi="Arial"/>
+          <w:sz w:val="24"/>
+        </w:rPr>
         <w:t>Interactive What-If Climate Stress Simulator: Sliders for SST Surge (+1-4°C), Sea Level Rise (+10-50cm), Salinity, and Dam Cuts.</w:t>
       </w:r>
     </w:p>
@@ -929,6 +1009,10 @@
         <w:pStyle w:val="ListBullet"/>
       </w:pPr>
       <w:r>
+        <w:rPr>
+          <w:rFonts w:ascii="Arial" w:hAnsi="Arial"/>
+          <w:sz w:val="24"/>
+        </w:rPr>
         <w:t>Live ML Decision Tree Inspector: Transparent rule-based logic inspector rendering explicit conditional rules.</w:t>
       </w:r>
     </w:p>
@@ -937,6 +1021,10 @@
         <w:pStyle w:val="ListBullet"/>
       </w:pPr>
       <w:r>
+        <w:rPr>
+          <w:rFonts w:ascii="Arial" w:hAnsi="Arial"/>
+          <w:sz w:val="24"/>
+        </w:rPr>
         <w:t>Model Diagnostics &amp; Explainable AI (XAI): High accuracy (R² = 0.985, RMSE = 3.12%). Feature weights: Shoreline Erosion (34.2%), Sea Level Rise (24.6%), Cyclones (18.4%), Salinity (12.5%), Temperature (10.3%). Note: Parameters do NOT carry equal weight.</w:t>
       </w:r>
     </w:p>
@@ -945,6 +1033,10 @@
         <w:pStyle w:val="ListBullet"/>
       </w:pPr>
       <w:r>
+        <w:rPr>
+          <w:rFonts w:ascii="Arial" w:hAnsi="Arial"/>
+          <w:sz w:val="24"/>
+        </w:rPr>
         <w:t>3 Academic Download Engines: Export ML Audit CSV Report, Download 168-Sample Training CSV, and Download Academic PDF Dossier.</w:t>
       </w:r>
     </w:p>
@@ -957,7 +1049,7 @@
           <w:rFonts w:ascii="Arial" w:hAnsi="Arial"/>
           <w:b/>
           <w:color w:val="10B981"/>
-          <w:sz w:val="26"/>
+          <w:sz w:val="28"/>
         </w:rPr>
         <w:t>Review 3 (Phase 3 / DA-3): 2050 Climate Forecasting &amp; Carbon Monetization</w:t>
       </w:r>
@@ -967,6 +1059,10 @@
         <w:pStyle w:val="ListBullet"/>
       </w:pPr>
       <w:r>
+        <w:rPr>
+          <w:rFonts w:ascii="Arial" w:hAnsi="Arial"/>
+          <w:sz w:val="24"/>
+        </w:rPr>
         <w:t>Expanded 12 Sanctuary Footprint: Pichavaram, Muthupet, Point Calimere, Punnakayal, Kazhuveli, Pulicat, Ramanathapuram, Devipattinam, Kanyakumari (NEW), Manamelkudi (NEW), Ennore (NEW), and Adyar (NEW).</w:t>
       </w:r>
     </w:p>
@@ -975,6 +1071,10 @@
         <w:pStyle w:val="ListBullet"/>
       </w:pPr>
       <w:r>
+        <w:rPr>
+          <w:rFonts w:ascii="Arial" w:hAnsi="Arial"/>
+          <w:sz w:val="24"/>
+        </w:rPr>
         <w:t>2025–2050 Long-Term IPCC AR6 Multi-Scenario Forecasting Suite: Compares SSP1-2.6 (Paris Goal, +15.98% to 33,100 ha), SSP2-4.5 (Moderate Action, +5.47% to 30,100 ha), SSP3-7.0 / 'SSP 3.7' (High Stress, -18.01% to 23,400 ha), and SSP5-8.5 (Extreme Warming Stress, -23.61% to 21,800 ha) up to Year 2050, alongside TN-SHORE Active Restoration targets (32,800 ha).</w:t>
       </w:r>
     </w:p>
@@ -983,6 +1083,10 @@
         <w:pStyle w:val="ListBullet"/>
       </w:pPr>
       <w:r>
+        <w:rPr>
+          <w:rFonts w:ascii="Arial" w:hAnsi="Arial"/>
+          <w:sz w:val="24"/>
+        </w:rPr>
         <w:t>Blue Carbon Credit Estimator ($ USD): Aligned with Article 6 of the Paris Agreement. Calculates Total Soil Carbon Stock (~4.28M tCO₂e), Annual Sequestration Rate (~185,500 tCO₂e/yr), and Annual Credit Revenue ($22.26M USD/yr at $120/ton).</w:t>
       </w:r>
     </w:p>
@@ -991,6 +1095,10 @@
         <w:pStyle w:val="ListBullet"/>
       </w:pPr>
       <w:r>
+        <w:rPr>
+          <w:rFonts w:ascii="Arial" w:hAnsi="Arial"/>
+          <w:sz w:val="24"/>
+        </w:rPr>
         <w:t>Copernicus Sentinel-2 10m NDVI Satellite Telemetry: Real-time vegetation index (NDVI = (NIR - RED)/(NIR + RED)) and 4-tier zonal unmixing (Dense Canopy, Moderate Fringes, Stressed Saplings, Water Channels).</w:t>
       </w:r>
     </w:p>
@@ -1003,38 +1111,62 @@
           <w:rFonts w:ascii="Arial" w:hAnsi="Arial"/>
           <w:b/>
           <w:color w:val="0F172A"/>
-          <w:sz w:val="30"/>
+          <w:sz w:val="32"/>
         </w:rPr>
         <w:t>4. Key Project Deliverables &amp; Outputs Summary</w:t>
       </w:r>
     </w:p>
     <w:p>
       <w:r>
+        <w:rPr>
+          <w:rFonts w:ascii="Arial" w:hAnsi="Arial"/>
+          <w:sz w:val="24"/>
+        </w:rPr>
         <w:t>1. Interactive Web Application: Running live on local server at http://localhost:5173/ with dark/light themes.</w:t>
       </w:r>
     </w:p>
     <w:p>
       <w:r>
+        <w:rPr>
+          <w:rFonts w:ascii="Arial" w:hAnsi="Arial"/>
+          <w:sz w:val="24"/>
+        </w:rPr>
         <w:t>2. Machine Learning Pipeline: Decision Tree &amp; XGBoost regression model with R² = 0.985 accuracy.</w:t>
       </w:r>
     </w:p>
     <w:p>
       <w:r>
+        <w:rPr>
+          <w:rFonts w:ascii="Arial" w:hAnsi="Arial"/>
+          <w:sz w:val="24"/>
+        </w:rPr>
         <w:t>3. Long-Term Climate Simulator: 2025–2050 IPCC emission scenario forecasting visualizer.</w:t>
       </w:r>
     </w:p>
     <w:p>
       <w:r>
+        <w:rPr>
+          <w:rFonts w:ascii="Arial" w:hAnsi="Arial"/>
+          <w:sz w:val="24"/>
+        </w:rPr>
         <w:t>4. Carbon Credit Monetization Engine: Article 6 Paris Agreement financial valuation calculator ($ USD).</w:t>
       </w:r>
     </w:p>
     <w:p>
       <w:r>
+        <w:rPr>
+          <w:rFonts w:ascii="Arial" w:hAnsi="Arial"/>
+          <w:sz w:val="24"/>
+        </w:rPr>
         <w:t>5. Remote Sensing Satellite Telemetry: Copernicus Sentinel-2 10m spectral vegetation health viewer.</w:t>
       </w:r>
     </w:p>
     <w:p>
       <w:r>
+        <w:rPr>
+          <w:rFonts w:ascii="Arial" w:hAnsi="Arial"/>
+          <w:sz w:val="24"/>
+        </w:rPr>
         <w:t>6. Academic Export Suite: Instant CSV audit report generation, 168-sample raw dataset CSV, and printable PDF dossiers.</w:t>
       </w:r>
     </w:p>
@@ -1411,9 +1543,6 @@
     <w:name w:val="Normal"/>
     <w:qFormat/>
     <w:rsid w:val="00FC693F"/>
-    <w:rPr>
-      <w:sz w:val="21"/>
-    </w:rPr>
   </w:style>
   <w:style w:type="paragraph" w:styleId="Header">
     <w:name w:val="header"/>

</xml_diff>